<commit_message>
completed the whole data data ingestion pipeline for file uploads
</commit_message>
<xml_diff>
--- a/ai_engine/parsers/langchain.docx
+++ b/ai_engine/parsers/langchain.docx
@@ -1,6 +1,6 @@
 
 <file path=word/document.xml><?xml version="1.0" encoding="utf-8"?>
-<w:document xmlns:wpc="http://schemas.microsoft.com/office/word/2010/wordprocessingCanvas" xmlns:cx="http://schemas.microsoft.com/office/drawing/2014/chartex" xmlns:cx1="http://schemas.microsoft.com/office/drawing/2015/9/8/chartex" xmlns:cx2="http://schemas.microsoft.com/office/drawing/2015/10/21/chartex" xmlns:cx3="http://schemas.microsoft.com/office/drawing/2016/5/9/chartex" xmlns:cx4="http://schemas.microsoft.com/office/drawing/2016/5/10/chartex" xmlns:cx5="http://schemas.microsoft.com/office/drawing/2016/5/11/chartex" xmlns:cx6="http://schemas.microsoft.com/office/drawing/2016/5/12/chartex" xmlns:cx7="http://schemas.microsoft.com/office/drawing/2016/5/13/chartex" xmlns:cx8="http://schemas.microsoft.com/office/drawing/2016/5/14/chartex" xmlns:mc="http://schemas.openxmlformats.org/markup-compatibility/2006" xmlns:aink="http://schemas.microsoft.com/office/drawing/2016/ink" xmlns:am3d="http://schemas.microsoft.com/office/drawing/2017/model3d" xmlns:o="urn:schemas-microsoft-com:office:office" xmlns:oel="http://schemas.microsoft.com/office/2019/extlst" xmlns:r="http://schemas.openxmlformats.org/officeDocument/2006/relationships" xmlns:m="http://schemas.openxmlformats.org/officeDocument/2006/math" xmlns:v="urn:schemas-microsoft-com:vml" xmlns:wp14="http://schemas.microsoft.com/office/word/2010/wordprocessingDrawing" xmlns:wp="http://schemas.openxmlformats.org/drawingml/2006/wordprocessingDrawing" xmlns:w10="urn:schemas-microsoft-com:office:word" xmlns:w="http://schemas.openxmlformats.org/wordprocessingml/2006/main" xmlns:w14="http://schemas.microsoft.com/office/word/2010/wordml" xmlns:w15="http://schemas.microsoft.com/office/word/2012/wordml" xmlns:w16cex="http://schemas.microsoft.com/office/word/2018/wordml/cex" xmlns:w16cid="http://schemas.microsoft.com/office/word/2016/wordml/cid" xmlns:w16="http://schemas.microsoft.com/office/word/2018/wordml" xmlns:w16du="http://schemas.microsoft.com/office/word/2023/wordml/word16du" xmlns:w16sdtdh="http://schemas.microsoft.com/office/word/2020/wordml/sdtdatahash" xmlns:w16sdtfl="http://schemas.microsoft.com/office/word/2024/wordml/sdtformatlock" xmlns:w16se="http://schemas.microsoft.com/office/word/2015/wordml/symex" xmlns:wpg="http://schemas.microsoft.com/office/word/2010/wordprocessingGroup" xmlns:wpi="http://schemas.microsoft.com/office/word/2010/wordprocessingInk" xmlns:wne="http://schemas.microsoft.com/office/word/2006/wordml" xmlns:wps="http://schemas.microsoft.com/office/word/2010/wordprocessingShape" mc:Ignorable="w14 w15 w16se w16cid w16 w16cex w16sdtdh w16sdtfl w16du wp14">
+<w:document xmlns:wpc="http://schemas.microsoft.com/office/word/2010/wordprocessingCanvas" xmlns:cx="http://schemas.microsoft.com/office/drawing/2014/chartex" xmlns:cx1="http://schemas.microsoft.com/office/drawing/2015/9/8/chartex" xmlns:cx2="http://schemas.microsoft.com/office/drawing/2015/10/21/chartex" xmlns:cx3="http://schemas.microsoft.com/office/drawing/2016/5/9/chartex" xmlns:cx4="http://schemas.microsoft.com/office/drawing/2016/5/10/chartex" xmlns:cx5="http://schemas.microsoft.com/office/drawing/2016/5/11/chartex" xmlns:cx6="http://schemas.microsoft.com/office/drawing/2016/5/12/chartex" xmlns:cx7="http://schemas.microsoft.com/office/drawing/2016/5/13/chartex" xmlns:cx8="http://schemas.microsoft.com/office/drawing/2016/5/14/chartex" xmlns:mc="http://schemas.openxmlformats.org/markup-compatibility/2006" xmlns:aink="http://schemas.microsoft.com/office/drawing/2016/ink" xmlns:am3d="http://schemas.microsoft.com/office/drawing/2017/model3d" xmlns:o="urn:schemas-microsoft-com:office:office" xmlns:oel="http://schemas.microsoft.com/office/2019/extlst" xmlns:r="http://schemas.openxmlformats.org/officeDocument/2006/relationships" xmlns:m="http://schemas.openxmlformats.org/officeDocument/2006/math" xmlns:v="urn:schemas-microsoft-com:vml" xmlns:wp14="http://schemas.microsoft.com/office/word/2010/wordprocessingDrawing" xmlns:wp="http://schemas.openxmlformats.org/drawingml/2006/wordprocessingDrawing" xmlns:w10="urn:schemas-microsoft-com:office:word" xmlns:w="http://schemas.openxmlformats.org/wordprocessingml/2006/main" xmlns:w14="http://schemas.microsoft.com/office/word/2010/wordml" xmlns:w15="http://schemas.microsoft.com/office/word/2012/wordml" xmlns:w16cei="http://schemas.microsoft.com/office/word/2026/wordml/cei" xmlns:w16cex="http://schemas.microsoft.com/office/word/2018/wordml/cex" xmlns:w16cid="http://schemas.microsoft.com/office/word/2016/wordml/cid" xmlns:w16="http://schemas.microsoft.com/office/word/2018/wordml" xmlns:w16du="http://schemas.microsoft.com/office/word/2023/wordml/word16du" xmlns:w16sdtdh="http://schemas.microsoft.com/office/word/2020/wordml/sdtdatahash" xmlns:w16sdtfl="http://schemas.microsoft.com/office/word/2024/wordml/sdtformatlock" xmlns:w16se="http://schemas.microsoft.com/office/word/2015/wordml/symex" xmlns:wpg="http://schemas.microsoft.com/office/word/2010/wordprocessingGroup" xmlns:wpi="http://schemas.microsoft.com/office/word/2010/wordprocessingInk" xmlns:wne="http://schemas.microsoft.com/office/word/2006/wordml" xmlns:wps="http://schemas.microsoft.com/office/word/2010/wordprocessingShape" mc:Ignorable="w14 w15 w16se w16cid w16 w16cex w16sdtdh w16sdtfl w16du wp14">
   <w:body>
     <w:p>
       <w:pPr>
@@ -9,21 +9,12 @@
           <w:bCs/>
         </w:rPr>
       </w:pPr>
-      <w:proofErr w:type="spellStart"/>
-      <w:r>
-        <w:rPr>
-          <w:b/>
-          <w:bCs/>
-        </w:rPr>
-        <w:t>LangChain</w:t>
-      </w:r>
-      <w:proofErr w:type="spellEnd"/>
-      <w:r>
-        <w:rPr>
-          <w:b/>
-          <w:bCs/>
-        </w:rPr>
-        <w:t xml:space="preserve"> Learning Roadmap</w:t>
+      <w:r>
+        <w:rPr>
+          <w:b/>
+          <w:bCs/>
+        </w:rPr>
+        <w:t>LangChain Learning Roadmap</w:t>
       </w:r>
     </w:p>
     <w:p>
@@ -43,15 +34,7 @@
     </w:p>
     <w:p>
       <w:r>
-        <w:t xml:space="preserve">Learn </w:t>
-      </w:r>
-      <w:proofErr w:type="spellStart"/>
-      <w:r>
-        <w:t>LangChain</w:t>
-      </w:r>
-      <w:proofErr w:type="spellEnd"/>
-      <w:r>
-        <w:t xml:space="preserve"> from the ground up by understanding each abstraction rather than simply using prebuilt agents.</w:t>
+        <w:t>Learn LangChain from the ground up by understanding each abstraction rather than simply using prebuilt agents.</w:t>
       </w:r>
     </w:p>
     <w:p>
@@ -162,15 +145,7 @@
         <w:t>✅</w:t>
       </w:r>
       <w:r>
-        <w:t xml:space="preserve"> </w:t>
-      </w:r>
-      <w:proofErr w:type="spellStart"/>
-      <w:r>
-        <w:t>ReAct</w:t>
-      </w:r>
-      <w:proofErr w:type="spellEnd"/>
-      <w:r>
-        <w:t xml:space="preserve"> Agent</w:t>
+        <w:t xml:space="preserve"> ReAct Agent</w:t>
       </w:r>
     </w:p>
     <w:p>
@@ -193,7 +168,7 @@
     <w:p>
       <w:r>
         <w:pict w14:anchorId="0D6BC940">
-          <v:rect id="_x0000_i1103" style="width:0;height:1.5pt" o:hralign="center" o:hrstd="t" o:hr="t" fillcolor="#a0a0a0" stroked="f"/>
+          <v:rect id="_x0000_i1025" style="width:0;height:1.5pt" o:hralign="center" o:hrstd="t" o:hr="t" fillcolor="#a0a0a0" stroked="f"/>
         </w:pict>
       </w:r>
     </w:p>
@@ -209,23 +184,7 @@
           <w:b/>
           <w:bCs/>
         </w:rPr>
-        <w:t xml:space="preserve">Module 1 — </w:t>
-      </w:r>
-      <w:proofErr w:type="spellStart"/>
-      <w:r>
-        <w:rPr>
-          <w:b/>
-          <w:bCs/>
-        </w:rPr>
-        <w:t>LangChain</w:t>
-      </w:r>
-      <w:proofErr w:type="spellEnd"/>
-      <w:r>
-        <w:rPr>
-          <w:b/>
-          <w:bCs/>
-        </w:rPr>
-        <w:t xml:space="preserve"> Fundamentals</w:t>
+        <w:t>Module 1 — LangChain Fundamentals</w:t>
       </w:r>
     </w:p>
     <w:p>
@@ -245,15 +204,7 @@
     </w:p>
     <w:p>
       <w:r>
-        <w:t xml:space="preserve">Understand the basic building blocks of </w:t>
-      </w:r>
-      <w:proofErr w:type="spellStart"/>
-      <w:r>
-        <w:t>LangChain</w:t>
-      </w:r>
-      <w:proofErr w:type="spellEnd"/>
-      <w:r>
-        <w:t>.</w:t>
+        <w:t>Understand the basic building blocks of LangChain.</w:t>
       </w:r>
     </w:p>
     <w:p>
@@ -279,15 +230,7 @@
         </w:numPr>
       </w:pPr>
       <w:r>
-        <w:t xml:space="preserve">What is </w:t>
-      </w:r>
-      <w:proofErr w:type="spellStart"/>
-      <w:r>
-        <w:t>LangChain</w:t>
-      </w:r>
-      <w:proofErr w:type="spellEnd"/>
-      <w:r>
-        <w:t>?</w:t>
+        <w:t>What is LangChain?</w:t>
       </w:r>
     </w:p>
     <w:p>
@@ -298,13 +241,8 @@
         </w:numPr>
       </w:pPr>
       <w:r>
-        <w:t xml:space="preserve">LLM vs </w:t>
-      </w:r>
-      <w:proofErr w:type="spellStart"/>
-      <w:r>
-        <w:t>ChatModel</w:t>
-      </w:r>
-      <w:proofErr w:type="spellEnd"/>
+        <w:t>LLM vs ChatModel</w:t>
+      </w:r>
     </w:p>
     <w:p>
       <w:pPr>
@@ -346,11 +284,9 @@
           <w:numId w:val="2"/>
         </w:numPr>
       </w:pPr>
-      <w:proofErr w:type="spellStart"/>
       <w:r>
         <w:t>ChatPromptTemplate</w:t>
       </w:r>
-      <w:proofErr w:type="spellEnd"/>
     </w:p>
     <w:p>
       <w:pPr>
@@ -465,7 +401,7 @@
     <w:p>
       <w:r>
         <w:pict w14:anchorId="7B145EB5">
-          <v:rect id="_x0000_i1104" style="width:0;height:1.5pt" o:hralign="center" o:hrstd="t" o:hr="t" fillcolor="#a0a0a0" stroked="f"/>
+          <v:rect id="_x0000_i1026" style="width:0;height:1.5pt" o:hralign="center" o:hrstd="t" o:hr="t" fillcolor="#a0a0a0" stroked="f"/>
         </w:pict>
       </w:r>
     </w:p>
@@ -481,23 +417,7 @@
           <w:b/>
           <w:bCs/>
         </w:rPr>
-        <w:t>Module 2 — LCEL (</w:t>
-      </w:r>
-      <w:proofErr w:type="spellStart"/>
-      <w:r>
-        <w:rPr>
-          <w:b/>
-          <w:bCs/>
-        </w:rPr>
-        <w:t>LangChain</w:t>
-      </w:r>
-      <w:proofErr w:type="spellEnd"/>
-      <w:r>
-        <w:rPr>
-          <w:b/>
-          <w:bCs/>
-        </w:rPr>
-        <w:t xml:space="preserve"> Expression Language)</w:t>
+        <w:t>Module 2 — LCEL (LangChain Expression Language)</w:t>
       </w:r>
     </w:p>
     <w:p>
@@ -517,15 +437,7 @@
     </w:p>
     <w:p>
       <w:r>
-        <w:t xml:space="preserve">Learn how </w:t>
-      </w:r>
-      <w:proofErr w:type="spellStart"/>
-      <w:r>
-        <w:t>LangChain</w:t>
-      </w:r>
-      <w:proofErr w:type="spellEnd"/>
-      <w:r>
-        <w:t xml:space="preserve"> connects components together.</w:t>
+        <w:t>Learn how LangChain connects components together.</w:t>
       </w:r>
     </w:p>
     <w:p>
@@ -561,11 +473,9 @@
           <w:numId w:val="3"/>
         </w:numPr>
       </w:pPr>
-      <w:proofErr w:type="spellStart"/>
       <w:r>
         <w:t>RunnableSequence</w:t>
       </w:r>
-      <w:proofErr w:type="spellEnd"/>
     </w:p>
     <w:p>
       <w:pPr>
@@ -574,11 +484,9 @@
           <w:numId w:val="3"/>
         </w:numPr>
       </w:pPr>
-      <w:proofErr w:type="spellStart"/>
       <w:r>
         <w:t>RunnableParallel</w:t>
       </w:r>
-      <w:proofErr w:type="spellEnd"/>
     </w:p>
     <w:p>
       <w:pPr>
@@ -587,11 +495,9 @@
           <w:numId w:val="3"/>
         </w:numPr>
       </w:pPr>
-      <w:proofErr w:type="spellStart"/>
       <w:r>
         <w:t>RunnablePassthrough</w:t>
       </w:r>
-      <w:proofErr w:type="spellEnd"/>
     </w:p>
     <w:p>
       <w:pPr>
@@ -701,7 +607,7 @@
     <w:p>
       <w:r>
         <w:pict w14:anchorId="57824A60">
-          <v:rect id="_x0000_i1105" style="width:0;height:1.5pt" o:hralign="center" o:hrstd="t" o:hr="t" fillcolor="#a0a0a0" stroked="f"/>
+          <v:rect id="_x0000_i1027" style="width:0;height:1.5pt" o:hralign="center" o:hrstd="t" o:hr="t" fillcolor="#a0a0a0" stroked="f"/>
         </w:pict>
       </w:r>
     </w:p>
@@ -737,15 +643,7 @@
     </w:p>
     <w:p>
       <w:r>
-        <w:t xml:space="preserve">Learn </w:t>
-      </w:r>
-      <w:proofErr w:type="spellStart"/>
-      <w:r>
-        <w:t>LangChain's</w:t>
-      </w:r>
-      <w:proofErr w:type="spellEnd"/>
-      <w:r>
-        <w:t xml:space="preserve"> tool abstraction.</w:t>
+        <w:t>Learn LangChain's tool abstraction.</w:t>
       </w:r>
     </w:p>
     <w:p>
@@ -868,7 +766,7 @@
     <w:p>
       <w:r>
         <w:pict w14:anchorId="3C6C3232">
-          <v:rect id="_x0000_i1106" style="width:0;height:1.5pt" o:hralign="center" o:hrstd="t" o:hr="t" fillcolor="#a0a0a0" stroked="f"/>
+          <v:rect id="_x0000_i1028" style="width:0;height:1.5pt" o:hralign="center" o:hrstd="t" o:hr="t" fillcolor="#a0a0a0" stroked="f"/>
         </w:pict>
       </w:r>
     </w:p>
@@ -904,15 +802,7 @@
     </w:p>
     <w:p>
       <w:r>
-        <w:t xml:space="preserve">Learn how </w:t>
-      </w:r>
-      <w:proofErr w:type="spellStart"/>
-      <w:r>
-        <w:t>LangChain</w:t>
-      </w:r>
-      <w:proofErr w:type="spellEnd"/>
-      <w:r>
-        <w:t xml:space="preserve"> stores conversations.</w:t>
+        <w:t>Learn how LangChain stores conversations.</w:t>
       </w:r>
     </w:p>
     <w:p>
@@ -1003,7 +893,7 @@
     <w:p>
       <w:r>
         <w:pict w14:anchorId="1DCE8288">
-          <v:rect id="_x0000_i1107" style="width:0;height:1.5pt" o:hralign="center" o:hrstd="t" o:hr="t" fillcolor="#a0a0a0" stroked="f"/>
+          <v:rect id="_x0000_i1029" style="width:0;height:1.5pt" o:hralign="center" o:hrstd="t" o:hr="t" fillcolor="#a0a0a0" stroked="f"/>
         </w:pict>
       </w:r>
     </w:p>
@@ -1039,15 +929,7 @@
     </w:p>
     <w:p>
       <w:r>
-        <w:t xml:space="preserve">Implement Retrieval-Augmented Generation using </w:t>
-      </w:r>
-      <w:proofErr w:type="spellStart"/>
-      <w:r>
-        <w:t>LangChain</w:t>
-      </w:r>
-      <w:proofErr w:type="spellEnd"/>
-      <w:r>
-        <w:t>.</w:t>
+        <w:t>Implement Retrieval-Augmented Generation using LangChain.</w:t>
       </w:r>
     </w:p>
     <w:p>
@@ -1159,7 +1041,7 @@
     <w:p>
       <w:r>
         <w:pict w14:anchorId="16725122">
-          <v:rect id="_x0000_i1108" style="width:0;height:1.5pt" o:hralign="center" o:hrstd="t" o:hr="t" fillcolor="#a0a0a0" stroked="f"/>
+          <v:rect id="_x0000_i1030" style="width:0;height:1.5pt" o:hralign="center" o:hrstd="t" o:hr="t" fillcolor="#a0a0a0" stroked="f"/>
         </w:pict>
       </w:r>
     </w:p>
@@ -1195,15 +1077,7 @@
     </w:p>
     <w:p>
       <w:r>
-        <w:t xml:space="preserve">Understand how </w:t>
-      </w:r>
-      <w:proofErr w:type="spellStart"/>
-      <w:r>
-        <w:t>LangChain</w:t>
-      </w:r>
-      <w:proofErr w:type="spellEnd"/>
-      <w:r>
-        <w:t xml:space="preserve"> implements agents.</w:t>
+        <w:t>Understand how LangChain implements agents.</w:t>
       </w:r>
     </w:p>
     <w:p>
@@ -1228,21 +1102,8 @@
           <w:numId w:val="8"/>
         </w:numPr>
       </w:pPr>
-      <w:proofErr w:type="spellStart"/>
-      <w:r>
-        <w:t>create_react_</w:t>
-      </w:r>
-      <w:proofErr w:type="gramStart"/>
-      <w:r>
-        <w:t>agent</w:t>
-      </w:r>
-      <w:proofErr w:type="spellEnd"/>
-      <w:r>
-        <w:t>(</w:t>
-      </w:r>
-      <w:proofErr w:type="gramEnd"/>
-      <w:r>
-        <w:t>)</w:t>
+      <w:r>
+        <w:t>create_react_agent()</w:t>
       </w:r>
     </w:p>
     <w:p>
@@ -1252,11 +1113,9 @@
           <w:numId w:val="8"/>
         </w:numPr>
       </w:pPr>
-      <w:proofErr w:type="spellStart"/>
       <w:r>
         <w:t>AgentExecutor</w:t>
       </w:r>
-      <w:proofErr w:type="spellEnd"/>
     </w:p>
     <w:p>
       <w:pPr>
@@ -1276,11 +1135,9 @@
           <w:numId w:val="8"/>
         </w:numPr>
       </w:pPr>
-      <w:proofErr w:type="spellStart"/>
       <w:r>
         <w:t>ReAct</w:t>
       </w:r>
-      <w:proofErr w:type="spellEnd"/>
     </w:p>
     <w:p>
       <w:pPr>
@@ -1338,21 +1195,13 @@
     </w:p>
     <w:p>
       <w:r>
-        <w:t xml:space="preserve">Compare it with your manually built </w:t>
-      </w:r>
-      <w:proofErr w:type="spellStart"/>
-      <w:r>
-        <w:t>ReAct</w:t>
-      </w:r>
-      <w:proofErr w:type="spellEnd"/>
-      <w:r>
-        <w:t xml:space="preserve"> agent.</w:t>
+        <w:t>Compare it with your manually built ReAct agent.</w:t>
       </w:r>
     </w:p>
     <w:p>
       <w:r>
         <w:pict w14:anchorId="3A9F41E5">
-          <v:rect id="_x0000_i1109" style="width:0;height:1.5pt" o:hralign="center" o:hrstd="t" o:hr="t" fillcolor="#a0a0a0" stroked="f"/>
+          <v:rect id="_x0000_i1031" style="width:0;height:1.5pt" o:hralign="center" o:hrstd="t" o:hr="t" fillcolor="#a0a0a0" stroked="f"/>
         </w:pict>
       </w:r>
     </w:p>
@@ -1388,15 +1237,7 @@
     </w:p>
     <w:p>
       <w:r>
-        <w:t xml:space="preserve">Learn </w:t>
-      </w:r>
-      <w:proofErr w:type="spellStart"/>
-      <w:r>
-        <w:t>LangChain's</w:t>
-      </w:r>
-      <w:proofErr w:type="spellEnd"/>
-      <w:r>
-        <w:t xml:space="preserve"> database toolkit.</w:t>
+        <w:t>Learn LangChain's database toolkit.</w:t>
       </w:r>
     </w:p>
     <w:p>
@@ -1421,11 +1262,9 @@
           <w:numId w:val="10"/>
         </w:numPr>
       </w:pPr>
-      <w:proofErr w:type="spellStart"/>
       <w:r>
         <w:t>SQLDatabase</w:t>
       </w:r>
-      <w:proofErr w:type="spellEnd"/>
     </w:p>
     <w:p>
       <w:pPr>
@@ -1434,11 +1273,9 @@
           <w:numId w:val="10"/>
         </w:numPr>
       </w:pPr>
-      <w:proofErr w:type="spellStart"/>
       <w:r>
         <w:t>SQLDatabaseToolkit</w:t>
       </w:r>
-      <w:proofErr w:type="spellEnd"/>
     </w:p>
     <w:p>
       <w:pPr>
@@ -1540,7 +1377,7 @@
     <w:p>
       <w:r>
         <w:pict w14:anchorId="0AAFBF0B">
-          <v:rect id="_x0000_i1110" style="width:0;height:1.5pt" o:hralign="center" o:hrstd="t" o:hr="t" fillcolor="#a0a0a0" stroked="f"/>
+          <v:rect id="_x0000_i1032" style="width:0;height:1.5pt" o:hralign="center" o:hrstd="t" o:hr="t" fillcolor="#a0a0a0" stroked="f"/>
         </w:pict>
       </w:r>
     </w:p>
@@ -1727,7 +1564,7 @@
     <w:p>
       <w:r>
         <w:pict w14:anchorId="1340BC1A">
-          <v:rect id="_x0000_i1111" style="width:0;height:1.5pt" o:hralign="center" o:hrstd="t" o:hr="t" fillcolor="#a0a0a0" stroked="f"/>
+          <v:rect id="_x0000_i1033" style="width:0;height:1.5pt" o:hralign="center" o:hrstd="t" o:hr="t" fillcolor="#a0a0a0" stroked="f"/>
         </w:pict>
       </w:r>
     </w:p>
@@ -1743,17 +1580,8 @@
           <w:b/>
           <w:bCs/>
         </w:rPr>
-        <w:t xml:space="preserve">Module 9 — </w:t>
-      </w:r>
-      <w:proofErr w:type="spellStart"/>
-      <w:r>
-        <w:rPr>
-          <w:b/>
-          <w:bCs/>
-        </w:rPr>
-        <w:t>LangGraph</w:t>
-      </w:r>
-      <w:proofErr w:type="spellEnd"/>
+        <w:t>Module 9 — LangGraph</w:t>
+      </w:r>
     </w:p>
     <w:p>
       <w:pPr>
@@ -1884,29 +1712,13 @@
     </w:p>
     <w:p>
       <w:r>
-        <w:t xml:space="preserve">Implement your </w:t>
-      </w:r>
-      <w:proofErr w:type="spellStart"/>
-      <w:r>
-        <w:t>ReAct</w:t>
-      </w:r>
-      <w:proofErr w:type="spellEnd"/>
-      <w:r>
-        <w:t xml:space="preserve"> agent using </w:t>
-      </w:r>
-      <w:proofErr w:type="spellStart"/>
-      <w:r>
-        <w:t>LangGraph</w:t>
-      </w:r>
-      <w:proofErr w:type="spellEnd"/>
-      <w:r>
-        <w:t>.</w:t>
+        <w:t>Implement your ReAct agent using LangGraph.</w:t>
       </w:r>
     </w:p>
     <w:p>
       <w:r>
         <w:pict w14:anchorId="357CE047">
-          <v:rect id="_x0000_i1112" style="width:0;height:1.5pt" o:hralign="center" o:hrstd="t" o:hr="t" fillcolor="#a0a0a0" stroked="f"/>
+          <v:rect id="_x0000_i1034" style="width:0;height:1.5pt" o:hralign="center" o:hrstd="t" o:hr="t" fillcolor="#a0a0a0" stroked="f"/>
         </w:pict>
       </w:r>
     </w:p>
@@ -2083,7 +1895,7 @@
     <w:p>
       <w:r>
         <w:pict w14:anchorId="12B4CB6D">
-          <v:rect id="_x0000_i1113" style="width:0;height:1.5pt" o:hralign="center" o:hrstd="t" o:hr="t" fillcolor="#a0a0a0" stroked="f"/>
+          <v:rect id="_x0000_i1035" style="width:0;height:1.5pt" o:hralign="center" o:hrstd="t" o:hr="t" fillcolor="#a0a0a0" stroked="f"/>
         </w:pict>
       </w:r>
     </w:p>
@@ -2261,7 +2073,7 @@
     <w:p>
       <w:r>
         <w:pict w14:anchorId="3CECE0F3">
-          <v:rect id="_x0000_i1114" style="width:0;height:1.5pt" o:hralign="center" o:hrstd="t" o:hr="t" fillcolor="#a0a0a0" stroked="f"/>
+          <v:rect id="_x0000_i1036" style="width:0;height:1.5pt" o:hralign="center" o:hrstd="t" o:hr="t" fillcolor="#a0a0a0" stroked="f"/>
         </w:pict>
       </w:r>
     </w:p>
@@ -2352,11 +2164,9 @@
           <w:numId w:val="16"/>
         </w:numPr>
       </w:pPr>
-      <w:proofErr w:type="spellStart"/>
       <w:r>
         <w:t>ReAct</w:t>
       </w:r>
-      <w:proofErr w:type="spellEnd"/>
     </w:p>
     <w:p>
       <w:pPr>
@@ -2387,13 +2197,8 @@
           <w:numId w:val="16"/>
         </w:numPr>
       </w:pPr>
-      <w:proofErr w:type="spellStart"/>
-      <w:r>
-        <w:t>LangGraph</w:t>
-      </w:r>
-      <w:proofErr w:type="spellEnd"/>
-      <w:r>
-        <w:t xml:space="preserve"> Workflow</w:t>
+      <w:r>
+        <w:t>LangGraph Workflow</w:t>
       </w:r>
     </w:p>
     <w:p>
@@ -2456,13 +2261,8 @@
       </w:r>
     </w:p>
     <w:p>
-      <w:proofErr w:type="spellStart"/>
-      <w:r>
-        <w:t>LangGraph</w:t>
-      </w:r>
-      <w:proofErr w:type="spellEnd"/>
-      <w:r>
-        <w:t xml:space="preserve"> Workflow</w:t>
+      <w:r>
+        <w:t>LangGraph Workflow</w:t>
       </w:r>
     </w:p>
     <w:p>
@@ -2503,13 +2303,8 @@
       </w:r>
     </w:p>
     <w:p>
-      <w:proofErr w:type="spellStart"/>
-      <w:r>
-        <w:t>ReAct</w:t>
-      </w:r>
-      <w:proofErr w:type="spellEnd"/>
-      <w:r>
-        <w:t xml:space="preserve"> Agent</w:t>
+      <w:r>
+        <w:t>ReAct Agent</w:t>
       </w:r>
     </w:p>
     <w:p>
@@ -2643,7 +2438,7 @@
     <w:p>
       <w:r>
         <w:pict w14:anchorId="667EA7A3">
-          <v:rect id="_x0000_i1115" style="width:0;height:1.5pt" o:hralign="center" o:hrstd="t" o:hr="t" fillcolor="#a0a0a0" stroked="f"/>
+          <v:rect id="_x0000_i1037" style="width:0;height:1.5pt" o:hralign="center" o:hrstd="t" o:hr="t" fillcolor="#a0a0a0" stroked="f"/>
         </w:pict>
       </w:r>
     </w:p>
@@ -2734,13 +2529,8 @@
         <w:t>✅</w:t>
       </w:r>
       <w:r>
-        <w:t xml:space="preserve"> </w:t>
-      </w:r>
-      <w:proofErr w:type="spellStart"/>
-      <w:r>
-        <w:t>ReAct</w:t>
-      </w:r>
-      <w:proofErr w:type="spellEnd"/>
+        <w:t xml:space="preserve"> ReAct</w:t>
+      </w:r>
     </w:p>
     <w:p>
       <w:r>
@@ -2748,13 +2538,8 @@
       </w:r>
     </w:p>
     <w:p>
-      <w:proofErr w:type="spellStart"/>
-      <w:r>
-        <w:t>LangChain</w:t>
-      </w:r>
-      <w:proofErr w:type="spellEnd"/>
-      <w:r>
-        <w:t xml:space="preserve"> Fundamentals</w:t>
+      <w:r>
+        <w:t>LangChain Fundamentals</w:t>
       </w:r>
     </w:p>
     <w:p>
@@ -2795,13 +2580,8 @@
     </w:p>
     <w:p>
       <w:r>
-        <w:t xml:space="preserve">RAG in </w:t>
-      </w:r>
-      <w:proofErr w:type="spellStart"/>
-      <w:r>
-        <w:t>LangChain</w:t>
-      </w:r>
-      <w:proofErr w:type="spellEnd"/>
+        <w:t>RAG in LangChain</w:t>
+      </w:r>
     </w:p>
     <w:p>
       <w:r>
@@ -2839,11 +2619,9 @@
       </w:r>
     </w:p>
     <w:p>
-      <w:proofErr w:type="spellStart"/>
       <w:r>
         <w:t>LangGraph</w:t>
       </w:r>
-      <w:proofErr w:type="spellEnd"/>
     </w:p>
     <w:p>
       <w:r>
@@ -2904,23 +2682,7 @@
         </w:numPr>
       </w:pPr>
       <w:r>
-        <w:t xml:space="preserve">Understand how </w:t>
-      </w:r>
-      <w:proofErr w:type="spellStart"/>
-      <w:r>
-        <w:t>LangChain</w:t>
-      </w:r>
-      <w:proofErr w:type="spellEnd"/>
-      <w:r>
-        <w:t xml:space="preserve"> and </w:t>
-      </w:r>
-      <w:proofErr w:type="spellStart"/>
-      <w:r>
-        <w:t>LangGraph</w:t>
-      </w:r>
-      <w:proofErr w:type="spellEnd"/>
-      <w:r>
-        <w:t xml:space="preserve"> work internally.</w:t>
+        <w:t>Understand how LangChain and LangGraph work internally.</w:t>
       </w:r>
     </w:p>
     <w:p>
@@ -2954,6 +2716,46 @@
       </w:pPr>
       <w:r>
         <w:t>Confidently work with modern LLM application frameworks.</w:t>
+      </w:r>
+    </w:p>
+    <w:p>
+      <w:r>
+        <w:lastRenderedPageBreak/>
+        <w:drawing>
+          <wp:inline distT="0" distB="0" distL="0" distR="0" wp14:anchorId="5DE4EE82" wp14:editId="7DA41C6D">
+            <wp:extent cx="5731510" cy="3587115"/>
+            <wp:effectExtent l="0" t="0" r="2540" b="0"/>
+            <wp:docPr id="1531560999" name="Picture 1"/>
+            <wp:cNvGraphicFramePr>
+              <a:graphicFrameLocks xmlns:a="http://schemas.openxmlformats.org/drawingml/2006/main" noChangeAspect="1"/>
+            </wp:cNvGraphicFramePr>
+            <a:graphic xmlns:a="http://schemas.openxmlformats.org/drawingml/2006/main">
+              <a:graphicData uri="http://schemas.openxmlformats.org/drawingml/2006/picture">
+                <pic:pic xmlns:pic="http://schemas.openxmlformats.org/drawingml/2006/picture">
+                  <pic:nvPicPr>
+                    <pic:cNvPr id="1531560999" name=""/>
+                    <pic:cNvPicPr/>
+                  </pic:nvPicPr>
+                  <pic:blipFill>
+                    <a:blip r:embed="rId5"/>
+                    <a:stretch>
+                      <a:fillRect/>
+                    </a:stretch>
+                  </pic:blipFill>
+                  <pic:spPr>
+                    <a:xfrm>
+                      <a:off x="0" y="0"/>
+                      <a:ext cx="5731510" cy="3587115"/>
+                    </a:xfrm>
+                    <a:prstGeom prst="rect">
+                      <a:avLst/>
+                    </a:prstGeom>
+                  </pic:spPr>
+                </pic:pic>
+              </a:graphicData>
+            </a:graphic>
+          </wp:inline>
+        </w:drawing>
       </w:r>
     </w:p>
     <w:p/>
@@ -2968,7 +2770,7 @@
 </file>
 
 <file path=word/numbering.xml><?xml version="1.0" encoding="utf-8"?>
-<w:numbering xmlns:wpc="http://schemas.microsoft.com/office/word/2010/wordprocessingCanvas" xmlns:cx="http://schemas.microsoft.com/office/drawing/2014/chartex" xmlns:cx1="http://schemas.microsoft.com/office/drawing/2015/9/8/chartex" xmlns:cx2="http://schemas.microsoft.com/office/drawing/2015/10/21/chartex" xmlns:cx3="http://schemas.microsoft.com/office/drawing/2016/5/9/chartex" xmlns:cx4="http://schemas.microsoft.com/office/drawing/2016/5/10/chartex" xmlns:cx5="http://schemas.microsoft.com/office/drawing/2016/5/11/chartex" xmlns:cx6="http://schemas.microsoft.com/office/drawing/2016/5/12/chartex" xmlns:cx7="http://schemas.microsoft.com/office/drawing/2016/5/13/chartex" xmlns:cx8="http://schemas.microsoft.com/office/drawing/2016/5/14/chartex" xmlns:mc="http://schemas.openxmlformats.org/markup-compatibility/2006" xmlns:aink="http://schemas.microsoft.com/office/drawing/2016/ink" xmlns:am3d="http://schemas.microsoft.com/office/drawing/2017/model3d" xmlns:o="urn:schemas-microsoft-com:office:office" xmlns:oel="http://schemas.microsoft.com/office/2019/extlst" xmlns:r="http://schemas.openxmlformats.org/officeDocument/2006/relationships" xmlns:m="http://schemas.openxmlformats.org/officeDocument/2006/math" xmlns:v="urn:schemas-microsoft-com:vml" xmlns:wp14="http://schemas.microsoft.com/office/word/2010/wordprocessingDrawing" xmlns:wp="http://schemas.openxmlformats.org/drawingml/2006/wordprocessingDrawing" xmlns:w10="urn:schemas-microsoft-com:office:word" xmlns:w="http://schemas.openxmlformats.org/wordprocessingml/2006/main" xmlns:w14="http://schemas.microsoft.com/office/word/2010/wordml" xmlns:w15="http://schemas.microsoft.com/office/word/2012/wordml" xmlns:w16cex="http://schemas.microsoft.com/office/word/2018/wordml/cex" xmlns:w16cid="http://schemas.microsoft.com/office/word/2016/wordml/cid" xmlns:w16="http://schemas.microsoft.com/office/word/2018/wordml" xmlns:w16du="http://schemas.microsoft.com/office/word/2023/wordml/word16du" xmlns:w16sdtdh="http://schemas.microsoft.com/office/word/2020/wordml/sdtdatahash" xmlns:w16sdtfl="http://schemas.microsoft.com/office/word/2024/wordml/sdtformatlock" xmlns:w16se="http://schemas.microsoft.com/office/word/2015/wordml/symex" xmlns:wpg="http://schemas.microsoft.com/office/word/2010/wordprocessingGroup" xmlns:wpi="http://schemas.microsoft.com/office/word/2010/wordprocessingInk" xmlns:wne="http://schemas.microsoft.com/office/word/2006/wordml" xmlns:wps="http://schemas.microsoft.com/office/word/2010/wordprocessingShape" mc:Ignorable="w14 w15 w16se w16cid w16 w16cex w16sdtdh w16sdtfl w16du wp14">
+<w:numbering xmlns:wpc="http://schemas.microsoft.com/office/word/2010/wordprocessingCanvas" xmlns:cx="http://schemas.microsoft.com/office/drawing/2014/chartex" xmlns:cx1="http://schemas.microsoft.com/office/drawing/2015/9/8/chartex" xmlns:cx2="http://schemas.microsoft.com/office/drawing/2015/10/21/chartex" xmlns:cx3="http://schemas.microsoft.com/office/drawing/2016/5/9/chartex" xmlns:cx4="http://schemas.microsoft.com/office/drawing/2016/5/10/chartex" xmlns:cx5="http://schemas.microsoft.com/office/drawing/2016/5/11/chartex" xmlns:cx6="http://schemas.microsoft.com/office/drawing/2016/5/12/chartex" xmlns:cx7="http://schemas.microsoft.com/office/drawing/2016/5/13/chartex" xmlns:cx8="http://schemas.microsoft.com/office/drawing/2016/5/14/chartex" xmlns:mc="http://schemas.openxmlformats.org/markup-compatibility/2006" xmlns:aink="http://schemas.microsoft.com/office/drawing/2016/ink" xmlns:am3d="http://schemas.microsoft.com/office/drawing/2017/model3d" xmlns:o="urn:schemas-microsoft-com:office:office" xmlns:oel="http://schemas.microsoft.com/office/2019/extlst" xmlns:r="http://schemas.openxmlformats.org/officeDocument/2006/relationships" xmlns:m="http://schemas.openxmlformats.org/officeDocument/2006/math" xmlns:v="urn:schemas-microsoft-com:vml" xmlns:wp14="http://schemas.microsoft.com/office/word/2010/wordprocessingDrawing" xmlns:wp="http://schemas.openxmlformats.org/drawingml/2006/wordprocessingDrawing" xmlns:w10="urn:schemas-microsoft-com:office:word" xmlns:w="http://schemas.openxmlformats.org/wordprocessingml/2006/main" xmlns:w14="http://schemas.microsoft.com/office/word/2010/wordml" xmlns:w15="http://schemas.microsoft.com/office/word/2012/wordml" xmlns:w16cei="http://schemas.microsoft.com/office/word/2026/wordml/cei" xmlns:w16cex="http://schemas.microsoft.com/office/word/2018/wordml/cex" xmlns:w16cid="http://schemas.microsoft.com/office/word/2016/wordml/cid" xmlns:w16="http://schemas.microsoft.com/office/word/2018/wordml" xmlns:w16du="http://schemas.microsoft.com/office/word/2023/wordml/word16du" xmlns:w16sdtdh="http://schemas.microsoft.com/office/word/2020/wordml/sdtdatahash" xmlns:w16sdtfl="http://schemas.microsoft.com/office/word/2024/wordml/sdtformatlock" xmlns:w16se="http://schemas.microsoft.com/office/word/2015/wordml/symex" xmlns:wpg="http://schemas.microsoft.com/office/word/2010/wordprocessingGroup" xmlns:wpi="http://schemas.microsoft.com/office/word/2010/wordprocessingInk" xmlns:wne="http://schemas.microsoft.com/office/word/2006/wordml" xmlns:wps="http://schemas.microsoft.com/office/word/2010/wordprocessingShape" mc:Ignorable="w14 w15 w16se w16cid w16 w16cex w16sdtdh w16sdtfl w16du wp14">
   <w:abstractNum w:abstractNumId="0" w15:restartNumberingAfterBreak="0">
     <w:nsid w:val="02DE37BF"/>
     <w:multiLevelType w:val="multilevel"/>
@@ -6159,6 +5961,7 @@
   <w:style w:type="character" w:default="1" w:styleId="DefaultParagraphFont">
     <w:name w:val="Default Paragraph Font"/>
     <w:uiPriority w:val="1"/>
+    <w:semiHidden/>
     <w:unhideWhenUsed/>
   </w:style>
   <w:style w:type="table" w:default="1" w:styleId="TableNormal">

</xml_diff>